<commit_message>
Business resumes: stop naming clients next to pricing or account issues
Describe CreditSea, Aadigo, WeRize, Babalease and Grip by type instead;
keep names only for neutral or positive work (GoldenPi, India Gold, Torque).

Co-Authored-By: Claude Opus 5.5 <noreply@anthropic.com>
Claude-Session: https://claude.ai/code/session_0137Xr7P5rjAJM8REY4zWF8g
</commit_message>
<xml_diff>
--- a/Resumes/READY-TO-GO/Business/Resume_Aaryan_Account-Executive-Manager.docx
+++ b/Resumes/READY-TO-GO/Business/Resume_Aaryan_Account-Executive-Manager.docx
@@ -302,7 +302,7 @@
         <w:t xml:space="preserve"> </w:t>
       </w:r>
       <w:r>
-        <w:t xml:space="preserve">turned a lender’s (CreditSea) price-cut ask into an</w:t>
+        <w:t xml:space="preserve">turned a digital lender’s price-cut ask into an</w:t>
       </w:r>
       <w:r>
         <w:t xml:space="preserve"> </w:t>
@@ -318,7 +318,7 @@
         <w:t xml:space="preserve"> </w:t>
       </w:r>
       <w:r>
-        <w:t xml:space="preserve">— a revenue floor — and used it to open first-mover Video KYC and eSign deals; closed a referral logo (Aadigo) on a monthly minimum plus a one-time implementation fee.</w:t>
+        <w:t xml:space="preserve">— a revenue floor — and used it to open first-mover Video KYC and eSign deals; closed a referred new logo on a monthly minimum plus a one-time implementation fee.</w:t>
       </w:r>
       <w:r>
         <w:t xml:space="preserve"> </w:t>
@@ -378,7 +378,7 @@
         <w:t xml:space="preserve"> </w:t>
       </w:r>
       <w:r>
-        <w:t xml:space="preserve">found modules billed with no signed agreement (WeRize) and a client running production on another NBFC’s credentials (Babalease); regularised both commercially and got the usage billed — no dispute.</w:t>
+        <w:t xml:space="preserve">found modules billed with no signed agreement and a lending client running production on another NBFC’s credentials; regularised both commercially and got the usage billed — no dispute.</w:t>
       </w:r>
       <w:r>
         <w:t xml:space="preserve"> </w:t>
@@ -416,7 +416,7 @@
         <w:t xml:space="preserve"> </w:t>
       </w:r>
       <w:r>
-        <w:t xml:space="preserve">at Grip Invest, then repositioned a compliant API as a regulatory-risk fix; unblocked an NBFC client’s go-live with KYB support; took India Gold</w:t>
+        <w:t xml:space="preserve">at a bond-investment platform, then repositioned a compliant API as a regulatory-risk fix; unblocked an NBFC client’s go-live with KYB support; took India Gold</w:t>
       </w:r>
       <w:r>
         <w:t xml:space="preserve"> </w:t>

</xml_diff>